<commit_message>
TTE : tanda tangan elektronik SKTM sekolah dan perorangan untuk lurah
</commit_message>
<xml_diff>
--- a/public/templates/SKTM_PERORANGAN.docx
+++ b/public/templates/SKTM_PERORANGAN.docx
@@ -3192,7 +3192,19 @@
                 <w:vertAlign w:val="baseline"/>
                 <w:lang w:val="en-US"/>
               </w:rPr>
-              <w:t>[[qr_here2]]</w:t>
+              <w:t>[[qr_camat</w:t>
+            </w:r>
+            <w:bookmarkStart w:id="0" w:name="_GoBack"/>
+            <w:bookmarkEnd w:id="0"/>
+            <w:r>
+              <w:rPr>
+                <w:rFonts w:hint="default" w:ascii="Arial" w:hAnsi="Arial"/>
+                <w:sz w:val="22"/>
+                <w:szCs w:val="22"/>
+                <w:vertAlign w:val="baseline"/>
+                <w:lang w:val="en-US"/>
+              </w:rPr>
+              <w:t>]]</w:t>
             </w:r>
           </w:p>
           <w:p>
@@ -3380,12 +3392,6 @@
           <w:insideH w:val="none" w:color="auto" w:sz="0" w:space="0"/>
           <w:insideV w:val="none" w:color="auto" w:sz="0" w:space="0"/>
         </w:tblBorders>
-        <w:tblCellMar>
-          <w:top w:w="0" w:type="dxa"/>
-          <w:left w:w="108" w:type="dxa"/>
-          <w:bottom w:w="0" w:type="dxa"/>
-          <w:right w:w="108" w:type="dxa"/>
-        </w:tblCellMar>
       </w:tblPrEx>
       <w:tc>
         <w:tcPr>

</xml_diff>